<commit_message>
Bump version to 3.57, rename main_03_56.py → main_03_57.py
Co-Authored-By: Claude Opus 4.6 (1M context) <noreply@anthropic.com>
</commit_message>
<xml_diff>
--- a/Docs/Quantori_CV_Manager_v354.docx
+++ b/Docs/Quantori_CV_Manager_v354.docx
@@ -72,13 +72,8 @@
     </w:p>
     <w:p>
       <w:r>
-        <w:rPr>
-          <w:noProof/>
-        </w:rPr>
-      </w:r>
-      <w:r>
-        <w:pict w14:anchorId="30A496FC">
-          <v:rect id="Horizontal Line 1" o:spid="_x0000_s1029" style="width:468pt;height:1.1pt;visibility:visible;mso-wrap-style:square;mso-left-percent:-10001;mso-top-percent:-10001;mso-position-horizontal:absolute;mso-position-horizontal-relative:char;mso-position-vertical:absolute;mso-position-vertical-relative:line;mso-left-percent:-10001;mso-top-percent:-10001;v-text-anchor:top" o:gfxdata="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" filled="f">
+        <w:pict w14:anchorId="49F70097">
+          <v:rect id="Horizontal Line 1" o:spid="_x0000_s1029" alt="" style="width:468pt;height:1.1pt;visibility:visible;mso-wrap-style:square;mso-width-percent:0;mso-height-percent:0;mso-left-percent:-10001;mso-top-percent:-10001;mso-position-horizontal:absolute;mso-position-horizontal-relative:char;mso-position-vertical:absolute;mso-position-vertical-relative:line;mso-width-percent:0;mso-height-percent:0;mso-left-percent:-10001;mso-top-percent:-10001;v-text-anchor:top" filled="f">
             <o:lock v:ext="edit" rotation="t" aspectratio="t" verticies="t" text="t" shapetype="t"/>
             <w10:anchorlock/>
           </v:rect>
@@ -1355,13 +1350,8 @@
     </w:p>
     <w:p>
       <w:r>
-        <w:rPr>
-          <w:noProof/>
-        </w:rPr>
-      </w:r>
-      <w:r>
-        <w:pict w14:anchorId="792B34AA">
-          <v:rect id="Horizontal Line 2" o:spid="_x0000_s1028" style="width:468pt;height:1.1pt;visibility:visible;mso-wrap-style:square;mso-left-percent:-10001;mso-top-percent:-10001;mso-position-horizontal:absolute;mso-position-horizontal-relative:char;mso-position-vertical:absolute;mso-position-vertical-relative:line;mso-left-percent:-10001;mso-top-percent:-10001;v-text-anchor:top" o:gfxdata="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" filled="f">
+        <w:pict w14:anchorId="40C76495">
+          <v:rect id="Horizontal Line 2" o:spid="_x0000_s1028" alt="" style="width:468pt;height:1.1pt;visibility:visible;mso-wrap-style:square;mso-width-percent:0;mso-height-percent:0;mso-left-percent:-10001;mso-top-percent:-10001;mso-position-horizontal:absolute;mso-position-horizontal-relative:char;mso-position-vertical:absolute;mso-position-vertical-relative:line;mso-width-percent:0;mso-height-percent:0;mso-left-percent:-10001;mso-top-percent:-10001;v-text-anchor:top" filled="f">
             <o:lock v:ext="edit" rotation="t" aspectratio="t" verticies="t" text="t" shapetype="t"/>
             <w10:anchorlock/>
           </v:rect>
@@ -1635,13 +1625,8 @@
     </w:p>
     <w:p>
       <w:r>
-        <w:rPr>
-          <w:noProof/>
-        </w:rPr>
-      </w:r>
-      <w:r>
-        <w:pict w14:anchorId="360B3904">
-          <v:rect id="Horizontal Line 3" o:spid="_x0000_s1027" style="width:468pt;height:1.1pt;visibility:visible;mso-wrap-style:square;mso-left-percent:-10001;mso-top-percent:-10001;mso-position-horizontal:absolute;mso-position-horizontal-relative:char;mso-position-vertical:absolute;mso-position-vertical-relative:line;mso-left-percent:-10001;mso-top-percent:-10001;v-text-anchor:top" o:gfxdata="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" filled="f">
+        <w:pict w14:anchorId="2710333F">
+          <v:rect id="Horizontal Line 3" o:spid="_x0000_s1027" alt="" style="width:468pt;height:1.1pt;visibility:visible;mso-wrap-style:square;mso-width-percent:0;mso-height-percent:0;mso-left-percent:-10001;mso-top-percent:-10001;mso-position-horizontal:absolute;mso-position-horizontal-relative:char;mso-position-vertical:absolute;mso-position-vertical-relative:line;mso-width-percent:0;mso-height-percent:0;mso-left-percent:-10001;mso-top-percent:-10001;v-text-anchor:top" filled="f">
             <o:lock v:ext="edit" rotation="t" aspectratio="t" verticies="t" text="t" shapetype="t"/>
             <w10:anchorlock/>
           </v:rect>
@@ -1741,13 +1726,8 @@
     </w:p>
     <w:p>
       <w:r>
-        <w:rPr>
-          <w:noProof/>
-        </w:rPr>
-      </w:r>
-      <w:r>
-        <w:pict w14:anchorId="67273AD9">
-          <v:rect id="Horizontal Line 4" o:spid="_x0000_s1026" style="width:468pt;height:1.1pt;visibility:visible;mso-wrap-style:square;mso-left-percent:-10001;mso-top-percent:-10001;mso-position-horizontal:absolute;mso-position-horizontal-relative:char;mso-position-vertical:absolute;mso-position-vertical-relative:line;mso-left-percent:-10001;mso-top-percent:-10001;v-text-anchor:top" o:gfxdata="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" filled="f">
+        <w:pict w14:anchorId="259C1ECF">
+          <v:rect id="Horizontal Line 4" o:spid="_x0000_s1026" alt="" style="width:468pt;height:1.1pt;visibility:visible;mso-wrap-style:square;mso-width-percent:0;mso-height-percent:0;mso-left-percent:-10001;mso-top-percent:-10001;mso-position-horizontal:absolute;mso-position-horizontal-relative:char;mso-position-vertical:absolute;mso-position-vertical-relative:line;mso-width-percent:0;mso-height-percent:0;mso-left-percent:-10001;mso-top-percent:-10001;v-text-anchor:top" filled="f">
             <o:lock v:ext="edit" rotation="t" aspectratio="t" verticies="t" text="t" shapetype="t"/>
             <w10:anchorlock/>
           </v:rect>

</xml_diff>